<commit_message>
lsito la sections de las firmas en el de verificacion
</commit_message>
<xml_diff>
--- a/public/templates/gfr-fo-12-template.docx
+++ b/public/templates/gfr-fo-12-template.docx
@@ -771,6 +771,9 @@
     </w:p>
     <w:p>
       <w:pPr>
+        <w:tabs>
+          <w:tab w:val="left" w:pos="4500"/>
+        </w:tabs>
         <w:rPr>
           <w:rFonts w:ascii="Arial" w:hAnsi="Arial" w:cs="Arial"/>
         </w:rPr>
@@ -785,7 +788,7 @@
         <w:rPr>
           <w:rFonts w:ascii="Arial" w:hAnsi="Arial" w:cs="Arial"/>
         </w:rPr>
-        <w:t xml:space="preserve">    </w:t>
+        <w:tab/>
       </w:r>
       <w:r>
         <w:rPr>
@@ -796,121 +799,37 @@
     </w:p>
     <w:p>
       <w:pPr>
-        <w:spacing w:after="0"/>
-        <w:jc w:val="both"/>
-        <w:rPr>
-          <w:rFonts w:ascii="Arial" w:hAnsi="Arial" w:cs="Arial"/>
-          <w:b/>
-          <w:bCs/>
-          <w:color w:val="000000" w:themeColor="text1"/>
-          <w:sz w:val="20"/>
-          <w:szCs w:val="20"/>
-        </w:rPr>
-      </w:pPr>
-      <w:r>
-        <w:rPr>
-          <w:rFonts w:ascii="Arial" w:hAnsi="Arial" w:cs="Arial"/>
-          <w:b/>
-          <w:bCs/>
-          <w:color w:val="000000" w:themeColor="text1"/>
-          <w:sz w:val="20"/>
-          <w:szCs w:val="20"/>
-        </w:rPr>
-        <w:t>FIRMA</w:t>
-      </w:r>
-      <w:r>
-        <w:rPr>
-          <w:rFonts w:ascii="Arial" w:hAnsi="Arial" w:cs="Arial"/>
-          <w:b/>
-          <w:bCs/>
-          <w:color w:val="000000" w:themeColor="text1"/>
-          <w:sz w:val="20"/>
-          <w:szCs w:val="20"/>
+        <w:tabs>
+          <w:tab w:val="left" w:pos="4500"/>
+        </w:tabs>
+        <w:rPr>
+          <w:rFonts w:ascii="Arial" w:hAnsi="Arial" w:cs="Arial"/>
+        </w:rPr>
+      </w:pPr>
+      <w:r>
+        <w:rPr>
+          <w:rFonts w:ascii="Arial" w:hAnsi="Arial" w:cs="Arial"/>
+        </w:rPr>
+        <w:t xml:space="preserve">FIRMA</w:t>
+      </w:r>
+      <w:r>
+        <w:rPr>
+          <w:rFonts w:ascii="Arial" w:hAnsi="Arial" w:cs="Arial"/>
         </w:rPr>
         <w:tab/>
       </w:r>
       <w:r>
         <w:rPr>
           <w:rFonts w:ascii="Arial" w:hAnsi="Arial" w:cs="Arial"/>
-          <w:b/>
-          <w:bCs/>
-          <w:color w:val="000000" w:themeColor="text1"/>
-          <w:sz w:val="20"/>
-          <w:szCs w:val="20"/>
-        </w:rPr>
-        <w:tab/>
-      </w:r>
-      <w:r>
-        <w:rPr>
-          <w:rFonts w:ascii="Arial" w:hAnsi="Arial" w:cs="Arial"/>
-          <w:b/>
-          <w:bCs/>
-          <w:color w:val="000000" w:themeColor="text1"/>
-          <w:sz w:val="20"/>
-          <w:szCs w:val="20"/>
-        </w:rPr>
-        <w:tab/>
-      </w:r>
-      <w:r>
-        <w:rPr>
-          <w:rFonts w:ascii="Arial" w:hAnsi="Arial" w:cs="Arial"/>
-          <w:b/>
-          <w:bCs/>
-          <w:color w:val="000000" w:themeColor="text1"/>
-          <w:sz w:val="20"/>
-          <w:szCs w:val="20"/>
-        </w:rPr>
-        <w:tab/>
-      </w:r>
-      <w:r>
-        <w:rPr>
-          <w:rFonts w:ascii="Arial" w:hAnsi="Arial" w:cs="Arial"/>
-          <w:b/>
-          <w:bCs/>
-          <w:color w:val="000000" w:themeColor="text1"/>
-          <w:sz w:val="20"/>
-          <w:szCs w:val="20"/>
-        </w:rPr>
-        <w:tab/>
-      </w:r>
-      <w:r>
-        <w:rPr>
-          <w:rFonts w:ascii="Arial" w:hAnsi="Arial" w:cs="Arial"/>
-          <w:b/>
-          <w:bCs/>
-          <w:color w:val="000000" w:themeColor="text1"/>
-          <w:sz w:val="20"/>
-          <w:szCs w:val="20"/>
-        </w:rPr>
-        <w:tab/>
-      </w:r>
-      <w:r>
-        <w:rPr>
-          <w:rFonts w:ascii="Arial" w:hAnsi="Arial" w:cs="Arial"/>
-          <w:b/>
-          <w:bCs/>
-          <w:color w:val="000000" w:themeColor="text1"/>
-          <w:sz w:val="20"/>
-          <w:szCs w:val="20"/>
-        </w:rPr>
-        <w:tab/>
-      </w:r>
-      <w:proofErr w:type="spellStart"/>
-      <w:r>
-        <w:rPr>
-          <w:rFonts w:ascii="Arial" w:hAnsi="Arial" w:cs="Arial"/>
-          <w:b/>
-          <w:bCs/>
-          <w:color w:val="000000" w:themeColor="text1"/>
-          <w:sz w:val="20"/>
-          <w:szCs w:val="20"/>
-        </w:rPr>
-        <w:t>FIRMA</w:t>
-      </w:r>
-      <w:proofErr w:type="spellEnd"/>
+        </w:rPr>
+        <w:t xml:space="preserve">FIRMA</w:t>
+      </w:r>
     </w:p>
     <w:p>
       <w:pPr>
+        <w:tabs>
+          <w:tab w:val="left" w:pos="4500"/>
+        </w:tabs>
         <w:rPr>
           <w:rFonts w:ascii="Arial" w:hAnsi="Arial" w:cs="Arial"/>
         </w:rPr>
@@ -925,11 +844,20 @@
         <w:rPr>
           <w:rFonts w:ascii="Arial" w:hAnsi="Arial" w:cs="Arial"/>
         </w:rPr>
-        <w:t xml:space="preserve">    NOMBRE: {supervisorNombre}</w:t>
+        <w:tab/>
+      </w:r>
+      <w:r>
+        <w:rPr>
+          <w:rFonts w:ascii="Arial" w:hAnsi="Arial" w:cs="Arial"/>
+        </w:rPr>
+        <w:t xml:space="preserve">NOMBRE: {supervisorNombre}</w:t>
       </w:r>
     </w:p>
     <w:p>
       <w:pPr>
+        <w:tabs>
+          <w:tab w:val="left" w:pos="4500"/>
+        </w:tabs>
         <w:rPr>
           <w:rFonts w:ascii="Arial" w:hAnsi="Arial" w:cs="Arial"/>
         </w:rPr>
@@ -944,85 +872,41 @@
         <w:rPr>
           <w:rFonts w:ascii="Arial" w:hAnsi="Arial" w:cs="Arial"/>
         </w:rPr>
-        <w:t xml:space="preserve">    CÉDULA: {supervisorCedula}</w:t>
+        <w:tab/>
+      </w:r>
+      <w:r>
+        <w:rPr>
+          <w:rFonts w:ascii="Arial" w:hAnsi="Arial" w:cs="Arial"/>
+        </w:rPr>
+        <w:t xml:space="preserve">CÉDULA: {supervisorCedula}</w:t>
       </w:r>
     </w:p>
     <w:p>
       <w:pPr>
-        <w:spacing w:after="0"/>
-        <w:jc w:val="both"/>
-        <w:rPr>
-          <w:rFonts w:ascii="Arial" w:hAnsi="Arial" w:cs="Arial"/>
-          <w:b/>
-          <w:bCs/>
-          <w:color w:val="000000" w:themeColor="text1"/>
-          <w:sz w:val="20"/>
-          <w:szCs w:val="20"/>
-        </w:rPr>
-      </w:pPr>
-      <w:r>
-        <w:rPr>
-          <w:rFonts w:ascii="Arial" w:hAnsi="Arial" w:cs="Arial"/>
-          <w:color w:val="000000" w:themeColor="text1"/>
-          <w:sz w:val="20"/>
-          <w:szCs w:val="20"/>
-        </w:rPr>
-        <w:t>Prestador de S</w:t>
-      </w:r>
-      <w:r>
-        <w:rPr>
-          <w:rFonts w:ascii="Arial" w:hAnsi="Arial" w:cs="Arial"/>
-          <w:color w:val="000000" w:themeColor="text1"/>
-          <w:sz w:val="20"/>
-          <w:szCs w:val="20"/>
-        </w:rPr>
-        <w:t>ervicios</w:t>
-      </w:r>
-      <w:r>
-        <w:rPr>
-          <w:rFonts w:ascii="Arial" w:hAnsi="Arial" w:cs="Arial"/>
-          <w:color w:val="000000" w:themeColor="text1"/>
-          <w:sz w:val="20"/>
-          <w:szCs w:val="20"/>
+        <w:tabs>
+          <w:tab w:val="left" w:pos="4500"/>
+        </w:tabs>
+        <w:rPr>
+          <w:rFonts w:ascii="Arial" w:hAnsi="Arial" w:cs="Arial"/>
+        </w:rPr>
+      </w:pPr>
+      <w:r>
+        <w:rPr>
+          <w:rFonts w:ascii="Arial" w:hAnsi="Arial" w:cs="Arial"/>
+        </w:rPr>
+        <w:t xml:space="preserve">Prestador de Servicios</w:t>
+      </w:r>
+      <w:r>
+        <w:rPr>
+          <w:rFonts w:ascii="Arial" w:hAnsi="Arial" w:cs="Arial"/>
         </w:rPr>
         <w:tab/>
       </w:r>
       <w:r>
         <w:rPr>
           <w:rFonts w:ascii="Arial" w:hAnsi="Arial" w:cs="Arial"/>
-          <w:color w:val="000000" w:themeColor="text1"/>
-          <w:sz w:val="20"/>
-          <w:szCs w:val="20"/>
-        </w:rPr>
-        <w:tab/>
-      </w:r>
-      <w:r>
-        <w:rPr>
-          <w:rFonts w:ascii="Arial" w:hAnsi="Arial" w:cs="Arial"/>
-          <w:color w:val="000000" w:themeColor="text1"/>
-          <w:sz w:val="20"/>
-          <w:szCs w:val="20"/>
-        </w:rPr>
-        <w:tab/>
-      </w:r>
-      <w:r>
-        <w:rPr>
-          <w:rFonts w:ascii="Arial" w:hAnsi="Arial" w:cs="Arial"/>
-          <w:color w:val="000000" w:themeColor="text1"/>
-          <w:sz w:val="20"/>
-          <w:szCs w:val="20"/>
-        </w:rPr>
-        <w:tab/>
-      </w:r>
-      <w:r>
-        <w:rPr>
-          <w:rFonts w:ascii="Arial" w:hAnsi="Arial" w:cs="Arial"/>
-          <w:color w:val="000000" w:themeColor="text1"/>
-          <w:sz w:val="20"/>
-          <w:szCs w:val="20"/>
-        </w:rPr>
-        <w:tab/>
-        <w:t>Supervisor</w:t>
+        </w:rPr>
+        <w:t xml:space="preserve">Supervisor</w:t>
       </w:r>
     </w:p>
     <w:p>

</xml_diff>

<commit_message>
corriendo errores de nader
</commit_message>
<xml_diff>
--- a/public/templates/gfr-fo-12-template.docx
+++ b/public/templates/gfr-fo-12-template.docx
@@ -458,7 +458,21 @@
             <w:hideMark/>
           </w:tcPr>
           <w:p>
+            <w:pPr>
+              <w:spacing w:after="0"/>
+              <w:jc w:val="center"/>
+              <w:rPr>
+                <w:rFonts w:ascii="Arial" w:hAnsi="Arial" w:cs="Arial"/>
+                <w:sz w:val="16"/>
+                <w:szCs w:val="16"/>
+              </w:rPr>
+            </w:pPr>
             <w:r>
+              <w:rPr>
+                <w:rFonts w:ascii="Arial" w:hAnsi="Arial" w:cs="Arial"/>
+                <w:sz w:val="16"/>
+                <w:szCs w:val="16"/>
+              </w:rPr>
               <w:t xml:space="preserve">{#filas}{numero}</w:t>
             </w:r>
           </w:p>
@@ -476,7 +490,21 @@
             <w:hideMark/>
           </w:tcPr>
           <w:p>
+            <w:pPr>
+              <w:spacing w:after="0"/>
+              <w:jc w:val="both"/>
+              <w:rPr>
+                <w:rFonts w:ascii="Arial" w:hAnsi="Arial" w:cs="Arial"/>
+                <w:sz w:val="16"/>
+                <w:szCs w:val="16"/>
+              </w:rPr>
+            </w:pPr>
             <w:r>
+              <w:rPr>
+                <w:rFonts w:ascii="Arial" w:hAnsi="Arial" w:cs="Arial"/>
+                <w:sz w:val="16"/>
+                <w:szCs w:val="16"/>
+              </w:rPr>
               <w:t xml:space="preserve">{descripcion}</w:t>
             </w:r>
           </w:p>
@@ -494,7 +522,21 @@
             <w:hideMark/>
           </w:tcPr>
           <w:p>
+            <w:pPr>
+              <w:spacing w:after="0"/>
+              <w:jc w:val="center"/>
+              <w:rPr>
+                <w:rFonts w:ascii="Arial" w:hAnsi="Arial" w:cs="Arial"/>
+                <w:sz w:val="16"/>
+                <w:szCs w:val="16"/>
+              </w:rPr>
+            </w:pPr>
             <w:r>
+              <w:rPr>
+                <w:rFonts w:ascii="Arial" w:hAnsi="Arial" w:cs="Arial"/>
+                <w:sz w:val="16"/>
+                <w:szCs w:val="16"/>
+              </w:rPr>
               <w:t xml:space="preserve">{pago1}</w:t>
             </w:r>
           </w:p>
@@ -513,7 +555,21 @@
             <w:hideMark/>
           </w:tcPr>
           <w:p>
+            <w:pPr>
+              <w:spacing w:after="0"/>
+              <w:jc w:val="center"/>
+              <w:rPr>
+                <w:rFonts w:ascii="Arial" w:hAnsi="Arial" w:cs="Arial"/>
+                <w:sz w:val="16"/>
+                <w:szCs w:val="16"/>
+              </w:rPr>
+            </w:pPr>
             <w:r>
+              <w:rPr>
+                <w:rFonts w:ascii="Arial" w:hAnsi="Arial" w:cs="Arial"/>
+                <w:sz w:val="16"/>
+                <w:szCs w:val="16"/>
+              </w:rPr>
               <w:t xml:space="preserve">{pago2}</w:t>
             </w:r>
           </w:p>
@@ -532,7 +588,21 @@
             <w:hideMark/>
           </w:tcPr>
           <w:p>
+            <w:pPr>
+              <w:spacing w:after="0"/>
+              <w:jc w:val="center"/>
+              <w:rPr>
+                <w:rFonts w:ascii="Arial" w:hAnsi="Arial" w:cs="Arial"/>
+                <w:sz w:val="16"/>
+                <w:szCs w:val="16"/>
+              </w:rPr>
+            </w:pPr>
             <w:r>
+              <w:rPr>
+                <w:rFonts w:ascii="Arial" w:hAnsi="Arial" w:cs="Arial"/>
+                <w:sz w:val="16"/>
+                <w:szCs w:val="16"/>
+              </w:rPr>
               <w:t xml:space="preserve">{pagoUltimo}</w:t>
             </w:r>
           </w:p>
@@ -551,7 +621,21 @@
             <w:hideMark/>
           </w:tcPr>
           <w:p>
+            <w:pPr>
+              <w:spacing w:after="0"/>
+              <w:jc w:val="center"/>
+              <w:rPr>
+                <w:rFonts w:ascii="Arial" w:hAnsi="Arial" w:cs="Arial"/>
+                <w:sz w:val="16"/>
+                <w:szCs w:val="16"/>
+              </w:rPr>
+            </w:pPr>
             <w:r>
+              <w:rPr>
+                <w:rFonts w:ascii="Arial" w:hAnsi="Arial" w:cs="Arial"/>
+                <w:sz w:val="16"/>
+                <w:szCs w:val="16"/>
+              </w:rPr>
               <w:t xml:space="preserve">{pagoUnico}</w:t>
             </w:r>
           </w:p>
@@ -569,7 +653,21 @@
             <w:hideMark/>
           </w:tcPr>
           <w:p>
+            <w:pPr>
+              <w:spacing w:after="0"/>
+              <w:jc w:val="both"/>
+              <w:rPr>
+                <w:rFonts w:ascii="Arial" w:hAnsi="Arial" w:cs="Arial"/>
+                <w:sz w:val="16"/>
+                <w:szCs w:val="16"/>
+              </w:rPr>
+            </w:pPr>
             <w:r>
+              <w:rPr>
+                <w:rFonts w:ascii="Arial" w:hAnsi="Arial" w:cs="Arial"/>
+                <w:sz w:val="16"/>
+                <w:szCs w:val="16"/>
+              </w:rPr>
               <w:t xml:space="preserve">{nota}</w:t>
             </w:r>
           </w:p>
@@ -588,7 +686,21 @@
             <w:hideMark/>
           </w:tcPr>
           <w:p>
+            <w:pPr>
+              <w:spacing w:after="0"/>
+              <w:jc w:val="center"/>
+              <w:rPr>
+                <w:rFonts w:ascii="Arial" w:hAnsi="Arial" w:cs="Arial"/>
+                <w:sz w:val="16"/>
+                <w:szCs w:val="16"/>
+              </w:rPr>
+            </w:pPr>
             <w:r>
+              <w:rPr>
+                <w:rFonts w:ascii="Arial" w:hAnsi="Arial" w:cs="Arial"/>
+                <w:sz w:val="16"/>
+                <w:szCs w:val="16"/>
+              </w:rPr>
               <w:t xml:space="preserve">{entrega}{/filas}</w:t>
             </w:r>
           </w:p>
@@ -771,16 +883,21 @@
     </w:p>
     <w:p>
       <w:pPr>
+        <w:spacing w:after="0" w:line="240" w:lineRule="auto"/>
         <w:tabs>
           <w:tab w:val="left" w:pos="4500"/>
         </w:tabs>
         <w:rPr>
           <w:rFonts w:ascii="Arial" w:hAnsi="Arial" w:cs="Arial"/>
+          <w:sz w:val="20"/>
+          <w:szCs w:val="20"/>
         </w:rPr>
       </w:pPr>
       <w:r>
         <w:rPr>
           <w:rFonts w:ascii="Arial" w:hAnsi="Arial" w:cs="Arial"/>
+          <w:sz w:val="20"/>
+          <w:szCs w:val="20"/>
         </w:rPr>
         <w:t xml:space="preserve">{%contratistaFirma}</w:t>
       </w:r>
@@ -793,22 +910,31 @@
       <w:r>
         <w:rPr>
           <w:rFonts w:ascii="Arial" w:hAnsi="Arial" w:cs="Arial"/>
+          <w:sz w:val="20"/>
+          <w:szCs w:val="20"/>
         </w:rPr>
         <w:t xml:space="preserve">{%supervisorFirma}</w:t>
       </w:r>
     </w:p>
     <w:p>
       <w:pPr>
+        <w:spacing w:after="0" w:line="240" w:lineRule="auto"/>
         <w:tabs>
           <w:tab w:val="left" w:pos="4500"/>
         </w:tabs>
         <w:rPr>
           <w:rFonts w:ascii="Arial" w:hAnsi="Arial" w:cs="Arial"/>
+          <w:sz w:val="20"/>
+          <w:szCs w:val="20"/>
         </w:rPr>
       </w:pPr>
       <w:r>
         <w:rPr>
           <w:rFonts w:ascii="Arial" w:hAnsi="Arial" w:cs="Arial"/>
+          <w:b/>
+          <w:bCs/>
+          <w:sz w:val="20"/>
+          <w:szCs w:val="20"/>
         </w:rPr>
         <w:t xml:space="preserve">FIRMA</w:t>
       </w:r>
@@ -821,22 +947,33 @@
       <w:r>
         <w:rPr>
           <w:rFonts w:ascii="Arial" w:hAnsi="Arial" w:cs="Arial"/>
+          <w:b/>
+          <w:bCs/>
+          <w:sz w:val="20"/>
+          <w:szCs w:val="20"/>
         </w:rPr>
         <w:t xml:space="preserve">FIRMA</w:t>
       </w:r>
     </w:p>
     <w:p>
       <w:pPr>
+        <w:spacing w:after="0" w:line="240" w:lineRule="auto"/>
         <w:tabs>
           <w:tab w:val="left" w:pos="4500"/>
         </w:tabs>
         <w:rPr>
           <w:rFonts w:ascii="Arial" w:hAnsi="Arial" w:cs="Arial"/>
+          <w:sz w:val="20"/>
+          <w:szCs w:val="20"/>
         </w:rPr>
       </w:pPr>
       <w:r>
         <w:rPr>
           <w:rFonts w:ascii="Arial" w:hAnsi="Arial" w:cs="Arial"/>
+          <w:b/>
+          <w:bCs/>
+          <w:sz w:val="20"/>
+          <w:szCs w:val="20"/>
         </w:rPr>
         <w:t xml:space="preserve">NOMBRE: {contratistaNombre}</w:t>
       </w:r>
@@ -849,22 +986,33 @@
       <w:r>
         <w:rPr>
           <w:rFonts w:ascii="Arial" w:hAnsi="Arial" w:cs="Arial"/>
+          <w:b/>
+          <w:bCs/>
+          <w:sz w:val="20"/>
+          <w:szCs w:val="20"/>
         </w:rPr>
         <w:t xml:space="preserve">NOMBRE: {supervisorNombre}</w:t>
       </w:r>
     </w:p>
     <w:p>
       <w:pPr>
+        <w:spacing w:after="0" w:line="240" w:lineRule="auto"/>
         <w:tabs>
           <w:tab w:val="left" w:pos="4500"/>
         </w:tabs>
         <w:rPr>
           <w:rFonts w:ascii="Arial" w:hAnsi="Arial" w:cs="Arial"/>
+          <w:sz w:val="20"/>
+          <w:szCs w:val="20"/>
         </w:rPr>
       </w:pPr>
       <w:r>
         <w:rPr>
           <w:rFonts w:ascii="Arial" w:hAnsi="Arial" w:cs="Arial"/>
+          <w:b/>
+          <w:bCs/>
+          <w:sz w:val="20"/>
+          <w:szCs w:val="20"/>
         </w:rPr>
         <w:t xml:space="preserve">CÉDULA: {contratistaCedula}</w:t>
       </w:r>
@@ -877,22 +1025,31 @@
       <w:r>
         <w:rPr>
           <w:rFonts w:ascii="Arial" w:hAnsi="Arial" w:cs="Arial"/>
+          <w:b/>
+          <w:bCs/>
+          <w:sz w:val="20"/>
+          <w:szCs w:val="20"/>
         </w:rPr>
         <w:t xml:space="preserve">CÉDULA: {supervisorCedula}</w:t>
       </w:r>
     </w:p>
     <w:p>
       <w:pPr>
+        <w:spacing w:after="0" w:line="240" w:lineRule="auto"/>
         <w:tabs>
           <w:tab w:val="left" w:pos="4500"/>
         </w:tabs>
         <w:rPr>
           <w:rFonts w:ascii="Arial" w:hAnsi="Arial" w:cs="Arial"/>
+          <w:sz w:val="20"/>
+          <w:szCs w:val="20"/>
         </w:rPr>
       </w:pPr>
       <w:r>
         <w:rPr>
           <w:rFonts w:ascii="Arial" w:hAnsi="Arial" w:cs="Arial"/>
+          <w:sz w:val="20"/>
+          <w:szCs w:val="20"/>
         </w:rPr>
         <w:t xml:space="preserve">Prestador de Servicios</w:t>
       </w:r>
@@ -905,6 +1062,8 @@
       <w:r>
         <w:rPr>
           <w:rFonts w:ascii="Arial" w:hAnsi="Arial" w:cs="Arial"/>
+          <w:sz w:val="20"/>
+          <w:szCs w:val="20"/>
         </w:rPr>
         <w:t xml:space="preserve">Supervisor</w:t>
       </w:r>

</xml_diff>